<commit_message>
Update labor cost calculation in COD process document
</commit_message>
<xml_diff>
--- a/01.WORKING_SPACE/2.TranVietHai-25410198/v1/Quy Trình Thu Phí COD.docx
+++ b/01.WORKING_SPACE/2.TranVietHai-25410198/v1/Quy Trình Thu Phí COD.docx
@@ -29515,7 +29515,7 @@
           <w:szCs w:val="18"/>
         </w:rPr>
         <w:drawing>
-          <wp:inline distT="0" distB="0" distL="0" distR="0" wp14:anchorId="10B07FE1" wp14:editId="220FB6FC">
+          <wp:inline distT="0" distB="0" distL="0" distR="0" wp14:anchorId="10B07FE1" wp14:editId="492A22AB">
             <wp:extent cx="5731510" cy="1971675"/>
             <wp:effectExtent l="0" t="0" r="2540" b="9525"/>
             <wp:docPr id="489833953" name="Picture 6"/>
@@ -35075,7 +35075,7 @@
               <w:rPr>
                 <w:sz w:val="18"/>
               </w:rPr>
-              <w:t>85</w:t>
+              <w:t>112</w:t>
             </w:r>
             <w:r>
               <w:rPr>
@@ -35087,7 +35087,7 @@
               <w:rPr>
                 <w:sz w:val="18"/>
               </w:rPr>
-              <w:t>2</w:t>
+              <w:t>8</w:t>
             </w:r>
             <w:r>
               <w:rPr>
@@ -39053,6 +39053,7 @@
   <w:style w:type="character" w:default="1" w:styleId="DefaultParagraphFont">
     <w:name w:val="Default Paragraph Font"/>
     <w:uiPriority w:val="1"/>
+    <w:semiHidden/>
     <w:unhideWhenUsed/>
   </w:style>
   <w:style w:type="table" w:default="1" w:styleId="TableNormal">

</xml_diff>